<commit_message>
Updates the CV docs
</commit_message>
<xml_diff>
--- a/public/doc/CV-Hemantkumar-Goswami.docx
+++ b/public/doc/CV-Hemantkumar-Goswami.docx
@@ -134,6 +134,7 @@
         </w:rPr>
       </w:pPr>
     </w:p>
+    <w:bookmarkStart w:id="2" w:name="DDE_LINK"/>
     <w:p>
       <w:pPr>
         <w:suppressAutoHyphens w:val="0"/>
@@ -142,7 +143,6 @@
           <w:lang w:val="en-GB" w:eastAsia="en-GB"/>
         </w:rPr>
       </w:pPr>
-      <w:bookmarkStart w:id="2" w:name="DDE_LINK"/>
       <w:r>
         <w:rPr>
           <w:noProof/>
@@ -1662,6 +1662,18 @@
     <w:p>
       <w:pPr>
         <w:suppressAutoHyphens w:val="0"/>
+        <w:rPr>
+          <w:b/>
+          <w:bCs/>
+          <w:sz w:val="26"/>
+          <w:szCs w:val="26"/>
+          <w:u w:val="single"/>
+        </w:rPr>
+      </w:pPr>
+    </w:p>
+    <w:p>
+      <w:pPr>
+        <w:suppressAutoHyphens w:val="0"/>
         <w:spacing w:before="100" w:beforeAutospacing="1" w:after="100" w:afterAutospacing="1"/>
         <w:rPr>
           <w:i/>
@@ -1677,7 +1689,7 @@
           <w:bCs/>
           <w:lang w:val="en-GB" w:eastAsia="en-GB"/>
         </w:rPr>
-        <w:t>UK Home Office</w:t>
+        <w:t>Crown Commercial Services</w:t>
       </w:r>
       <w:r>
         <w:rPr>
@@ -1699,7 +1711,7 @@
           <w:iCs/>
           <w:lang w:val="en-GB" w:eastAsia="en-GB"/>
         </w:rPr>
-        <w:t>Nov</w:t>
+        <w:t>Feb</w:t>
       </w:r>
       <w:r>
         <w:rPr>
@@ -1707,7 +1719,7 @@
           <w:iCs/>
           <w:lang w:val="en-GB" w:eastAsia="en-GB"/>
         </w:rPr>
-        <w:t xml:space="preserve"> 20</w:t>
+        <w:t xml:space="preserve"> </w:t>
       </w:r>
       <w:r>
         <w:rPr>
@@ -1715,7 +1727,7 @@
           <w:iCs/>
           <w:lang w:val="en-GB" w:eastAsia="en-GB"/>
         </w:rPr>
-        <w:t>16</w:t>
+        <w:t>2026</w:t>
       </w:r>
       <w:r>
         <w:rPr>
@@ -1731,7 +1743,7 @@
           <w:iCs/>
           <w:lang w:val="en-GB" w:eastAsia="en-GB"/>
         </w:rPr>
-        <w:t>Nov 2025</w:t>
+        <w:t>Current*</w:t>
       </w:r>
       <w:r>
         <w:rPr>
@@ -1751,7 +1763,17 @@
           <w:szCs w:val="16"/>
           <w:lang w:val="en-GB" w:eastAsia="en-GB"/>
         </w:rPr>
-        <w:t>Lead Developer / Senior Software Engineer</w:t>
+        <w:t xml:space="preserve">Lead Developer / </w:t>
+      </w:r>
+      <w:r>
+        <w:rPr>
+          <w:b/>
+          <w:bCs/>
+          <w:sz w:val="16"/>
+          <w:szCs w:val="16"/>
+          <w:lang w:val="en-GB" w:eastAsia="en-GB"/>
+        </w:rPr>
+        <w:t>Senior Python Developer</w:t>
       </w:r>
     </w:p>
     <w:p>
@@ -1769,7 +1791,208 @@
         <w:t>Technologies:</w:t>
       </w:r>
       <w:r>
-        <w:t xml:space="preserve"> AWS, Java, Spring, Python, Node.js, React, PostgreSQL, PHP, Symfony, Drupal, Docker, Kubernetes, CI/CD (Drone, Jenkins), RESTful APIs, Mocha, JIRA, Git, SonarQube, VirtualBox, Sysdig, Kibana, Quay, Artifactory, Selenium, TDD, BDD</w:t>
+        <w:t xml:space="preserve"> </w:t>
+      </w:r>
+      <w:r>
+        <w:t>AWS, Python</w:t>
+      </w:r>
+      <w:r>
+        <w:t xml:space="preserve">, </w:t>
+      </w:r>
+      <w:r>
+        <w:t xml:space="preserve">Flask, </w:t>
+      </w:r>
+      <w:r>
+        <w:t xml:space="preserve">Node.js, </w:t>
+      </w:r>
+      <w:r>
+        <w:t xml:space="preserve">Typescript, </w:t>
+      </w:r>
+      <w:r>
+        <w:t>React, PostgreSQL, CI/CD (Jenkins), RESTful APIs, Mocha, JIRA, Git, SonarQube, VirtualBox, Artifactory, TDD, BDD</w:t>
+      </w:r>
+      <w:r>
+        <w:t>, GDS Delivery Framework</w:t>
+      </w:r>
+    </w:p>
+    <w:p>
+      <w:pPr>
+        <w:suppressAutoHyphens w:val="0"/>
+        <w:spacing w:before="100" w:beforeAutospacing="1" w:after="100" w:afterAutospacing="1"/>
+        <w:rPr>
+          <w:b/>
+          <w:bCs/>
+          <w:lang w:val="en-GB" w:eastAsia="en-GB"/>
+        </w:rPr>
+      </w:pPr>
+      <w:r>
+        <w:rPr>
+          <w:lang w:val="en-GB" w:eastAsia="en-GB"/>
+        </w:rPr>
+        <w:t>Came in to help with rebranding of CCS Crown Commercial Services to Government Commercial Agency</w:t>
+      </w:r>
+      <w:r>
+        <w:rPr>
+          <w:lang w:val="en-GB" w:eastAsia="en-GB"/>
+        </w:rPr>
+        <w:t xml:space="preserve">. This task involves </w:t>
+      </w:r>
+      <w:r>
+        <w:rPr>
+          <w:lang w:val="en-GB" w:eastAsia="en-GB"/>
+        </w:rPr>
+        <w:t xml:space="preserve">making deep changes into a huge codebase spanning </w:t>
+      </w:r>
+      <w:r>
+        <w:rPr>
+          <w:lang w:val="en-GB" w:eastAsia="en-GB"/>
+        </w:rPr>
+        <w:t xml:space="preserve">up to 30 different repositories (Projects). This is the backbone of all the </w:t>
+      </w:r>
+      <w:r>
+        <w:rPr>
+          <w:lang w:val="en-GB" w:eastAsia="en-GB"/>
+        </w:rPr>
+        <w:t>government frameworks available for suppliers.</w:t>
+      </w:r>
+      <w:r>
+        <w:rPr>
+          <w:lang w:val="en-GB" w:eastAsia="en-GB"/>
+        </w:rPr>
+        <w:br/>
+      </w:r>
+    </w:p>
+    <w:p>
+      <w:pPr>
+        <w:suppressAutoHyphens w:val="0"/>
+        <w:spacing w:before="100" w:beforeAutospacing="1" w:after="100" w:afterAutospacing="1"/>
+        <w:rPr>
+          <w:b/>
+          <w:bCs/>
+          <w:lang w:val="en-GB" w:eastAsia="en-GB"/>
+        </w:rPr>
+      </w:pPr>
+    </w:p>
+    <w:p>
+      <w:pPr>
+        <w:suppressAutoHyphens w:val="0"/>
+        <w:spacing w:before="100" w:beforeAutospacing="1" w:after="100" w:afterAutospacing="1"/>
+        <w:rPr>
+          <w:i/>
+          <w:iCs/>
+          <w:sz w:val="22"/>
+          <w:szCs w:val="22"/>
+          <w:lang w:val="en-GB" w:eastAsia="en-GB"/>
+        </w:rPr>
+      </w:pPr>
+      <w:r>
+        <w:rPr>
+          <w:b/>
+          <w:bCs/>
+          <w:lang w:val="en-GB" w:eastAsia="en-GB"/>
+        </w:rPr>
+        <w:t>UK Home Office</w:t>
+      </w:r>
+      <w:r>
+        <w:rPr>
+          <w:lang w:val="en-GB" w:eastAsia="en-GB"/>
+        </w:rPr>
+        <w:t xml:space="preserve"> – </w:t>
+      </w:r>
+      <w:r>
+        <w:rPr>
+          <w:i/>
+          <w:iCs/>
+          <w:lang w:val="en-GB" w:eastAsia="en-GB"/>
+        </w:rPr>
+        <w:t xml:space="preserve">London, UK </w:t>
+      </w:r>
+      <w:r>
+        <w:rPr>
+          <w:i/>
+          <w:iCs/>
+          <w:lang w:val="en-GB" w:eastAsia="en-GB"/>
+        </w:rPr>
+        <w:t>Nov</w:t>
+      </w:r>
+      <w:r>
+        <w:rPr>
+          <w:i/>
+          <w:iCs/>
+          <w:lang w:val="en-GB" w:eastAsia="en-GB"/>
+        </w:rPr>
+        <w:t xml:space="preserve"> 20</w:t>
+      </w:r>
+      <w:r>
+        <w:rPr>
+          <w:i/>
+          <w:iCs/>
+          <w:lang w:val="en-GB" w:eastAsia="en-GB"/>
+        </w:rPr>
+        <w:t>16</w:t>
+      </w:r>
+      <w:r>
+        <w:rPr>
+          <w:i/>
+          <w:iCs/>
+          <w:lang w:val="en-GB" w:eastAsia="en-GB"/>
+        </w:rPr>
+        <w:t xml:space="preserve"> – </w:t>
+      </w:r>
+      <w:r>
+        <w:rPr>
+          <w:i/>
+          <w:iCs/>
+          <w:lang w:val="en-GB" w:eastAsia="en-GB"/>
+        </w:rPr>
+        <w:t>Nov 2025</w:t>
+      </w:r>
+      <w:r>
+        <w:rPr>
+          <w:i/>
+          <w:iCs/>
+          <w:sz w:val="22"/>
+          <w:szCs w:val="22"/>
+          <w:lang w:val="en-GB" w:eastAsia="en-GB"/>
+        </w:rPr>
+        <w:br/>
+      </w:r>
+      <w:r>
+        <w:rPr>
+          <w:b/>
+          <w:bCs/>
+          <w:sz w:val="16"/>
+          <w:szCs w:val="16"/>
+          <w:lang w:val="en-GB" w:eastAsia="en-GB"/>
+        </w:rPr>
+        <w:t>Lead Developer / Senior Software Engineer</w:t>
+      </w:r>
+    </w:p>
+    <w:p>
+      <w:pPr>
+        <w:suppressAutoHyphens w:val="0"/>
+        <w:spacing w:beforeAutospacing="1" w:after="100" w:afterAutospacing="1"/>
+        <w:rPr>
+          <w:lang w:val="en-GB" w:eastAsia="en-GB"/>
+        </w:rPr>
+      </w:pPr>
+      <w:r>
+        <w:rPr>
+          <w:rStyle w:val="Strong"/>
+        </w:rPr>
+        <w:t>Technologies:</w:t>
+      </w:r>
+      <w:r>
+        <w:t xml:space="preserve"> AWS, Java, Spring, Python, Node.js</w:t>
+      </w:r>
+      <w:r>
+        <w:t xml:space="preserve">, </w:t>
+      </w:r>
+      <w:r>
+        <w:t>Typescript</w:t>
+      </w:r>
+      <w:r>
+        <w:t>, React, PostgreSQL, PHP, Symfony, Drupal, Docker, Kubernetes, CI/CD (Drone, Jenkins), RESTful APIs, Mocha, JIRA, Git, SonarQube, VirtualBox, Sysdig, Kibana, Quay, Artifactory, Selenium, TDD, BDD</w:t>
       </w:r>
       <w:r>
         <w:t>, GDS Delivery Framework</w:t>
@@ -2159,6 +2382,11 @@
           <w:lang w:val="en-GB" w:eastAsia="en-GB"/>
         </w:rPr>
         <w:br/>
+      </w:r>
+    </w:p>
+    <w:p>
+      <w:r>
+        <w:br w:type="page"/>
       </w:r>
     </w:p>
     <w:tbl>
@@ -2198,6 +2426,7 @@
               <w:rPr>
                 <w:b/>
               </w:rPr>
+              <w:lastRenderedPageBreak/>
               <w:t xml:space="preserve">Elevate Credit International Ltd </w:t>
             </w:r>
             <w:r>
@@ -2432,254 +2661,27 @@
       </w:tr>
     </w:tbl>
     <w:p>
-      <w:r>
+      <w:pPr>
         <w:rPr>
           <w:i/>
           <w:iCs/>
         </w:rPr>
-        <w:br w:type="page"/>
-      </w:r>
-    </w:p>
-    <w:tbl>
-      <w:tblPr>
-        <w:tblW w:w="10079" w:type="dxa"/>
-        <w:tblLayout w:type="fixed"/>
-        <w:tblCellMar>
-          <w:top w:w="55" w:type="dxa"/>
-          <w:left w:w="55" w:type="dxa"/>
-          <w:bottom w:w="55" w:type="dxa"/>
-          <w:right w:w="55" w:type="dxa"/>
-        </w:tblCellMar>
-        <w:tblLook w:val="0000" w:firstRow="0" w:lastRow="0" w:firstColumn="0" w:lastColumn="0" w:noHBand="0" w:noVBand="0"/>
-      </w:tblPr>
-      <w:tblGrid>
-        <w:gridCol w:w="10079"/>
-      </w:tblGrid>
-      <w:tr>
-        <w:trPr>
-          <w:trHeight w:val="275"/>
-        </w:trPr>
-        <w:tc>
-          <w:tcPr>
-            <w:tcW w:w="10079" w:type="dxa"/>
-          </w:tcPr>
-          <w:p>
-            <w:pPr>
-              <w:pStyle w:val="Caption"/>
-              <w:rPr>
-                <w:i w:val="0"/>
-                <w:iCs w:val="0"/>
-                <w:sz w:val="16"/>
-                <w:szCs w:val="16"/>
-              </w:rPr>
-            </w:pPr>
-            <w:r>
-              <w:rPr>
-                <w:rStyle w:val="Strong"/>
-              </w:rPr>
-              <w:lastRenderedPageBreak/>
-              <w:t>Salmon Ltd</w:t>
-            </w:r>
-            <w:r>
-              <w:t xml:space="preserve"> – London, </w:t>
-            </w:r>
-            <w:r>
-              <w:t>UK</w:t>
-            </w:r>
-            <w:r>
-              <w:rPr>
-                <w:b/>
-                <w:bCs/>
-              </w:rPr>
-              <w:t xml:space="preserve"> </w:t>
-            </w:r>
-            <w:r>
-              <w:rPr>
-                <w:rStyle w:val="Strong"/>
-                <w:b w:val="0"/>
-                <w:bCs w:val="0"/>
-              </w:rPr>
-              <w:t>Nov 2015 – Mar 2016</w:t>
-            </w:r>
-            <w:r>
-              <w:rPr>
-                <w:rStyle w:val="Strong"/>
-                <w:b w:val="0"/>
-                <w:bCs w:val="0"/>
-              </w:rPr>
-              <w:br/>
-            </w:r>
-            <w:r>
-              <w:rPr>
-                <w:rStyle w:val="IntenseEmphasis"/>
-                <w:color w:val="auto"/>
-                <w:sz w:val="16"/>
-                <w:szCs w:val="16"/>
-              </w:rPr>
-              <w:t>Senior PHP Developer</w:t>
-            </w:r>
-          </w:p>
-          <w:p>
-            <w:pPr>
-              <w:pStyle w:val="NormalWeb"/>
-              <w:rPr>
-                <w:rStyle w:val="Strong"/>
-                <w:sz w:val="2"/>
-                <w:szCs w:val="2"/>
-              </w:rPr>
-            </w:pPr>
-          </w:p>
-          <w:p>
-            <w:pPr>
-              <w:pStyle w:val="NormalWeb"/>
-            </w:pPr>
-            <w:r>
-              <w:rPr>
-                <w:rStyle w:val="Strong"/>
-              </w:rPr>
-              <w:t>Technologies:</w:t>
-            </w:r>
-            <w:r>
-              <w:t xml:space="preserve"> PHP, Symfony, Drupal, MySQL, MongoDB, AJAX, PHPUnit, Codeception, JIRA, Git, STASH, RESTful APIs, SOAP, XML, JSON, Grunt, Vagrant, Jenkins</w:t>
-            </w:r>
-          </w:p>
-          <w:p>
-            <w:pPr>
-              <w:pStyle w:val="NormalWeb"/>
-            </w:pPr>
-            <w:r>
-              <w:rPr>
-                <w:rStyle w:val="Strong"/>
-              </w:rPr>
-              <w:t>Key Contributions:</w:t>
-            </w:r>
-          </w:p>
-          <w:p>
-            <w:pPr>
-              <w:pStyle w:val="NormalWeb"/>
-              <w:numPr>
-                <w:ilvl w:val="0"/>
-                <w:numId w:val="34"/>
-              </w:numPr>
-              <w:suppressAutoHyphens w:val="0"/>
-              <w:spacing w:beforeAutospacing="1" w:afterAutospacing="1"/>
-            </w:pPr>
-            <w:r>
-              <w:t xml:space="preserve">Migrated </w:t>
-            </w:r>
-            <w:r>
-              <w:rPr>
-                <w:rStyle w:val="Strong"/>
-              </w:rPr>
-              <w:t>Travelodge’s legacy Drupal system</w:t>
-            </w:r>
-            <w:r>
-              <w:t xml:space="preserve"> to a modern, responsive architecture using </w:t>
-            </w:r>
-            <w:r>
-              <w:rPr>
-                <w:rStyle w:val="Strong"/>
-              </w:rPr>
-              <w:t>Symfony</w:t>
-            </w:r>
-            <w:r>
-              <w:t>, with updated front-end tooling and scalable backend services</w:t>
-            </w:r>
-          </w:p>
-          <w:p>
-            <w:pPr>
-              <w:pStyle w:val="NormalWeb"/>
-              <w:numPr>
-                <w:ilvl w:val="0"/>
-                <w:numId w:val="34"/>
-              </w:numPr>
-              <w:suppressAutoHyphens w:val="0"/>
-              <w:spacing w:beforeAutospacing="1" w:afterAutospacing="1"/>
-            </w:pPr>
-            <w:r>
-              <w:t xml:space="preserve">Delivered high-quality code enhancements, restructured legacy components, and applied </w:t>
-            </w:r>
-            <w:r>
-              <w:rPr>
-                <w:rStyle w:val="Strong"/>
-              </w:rPr>
-              <w:t>design patterns</w:t>
-            </w:r>
-            <w:r>
-              <w:t xml:space="preserve"> to boost application performance and maintainability</w:t>
-            </w:r>
-          </w:p>
-          <w:p>
-            <w:pPr>
-              <w:pStyle w:val="NormalWeb"/>
-              <w:numPr>
-                <w:ilvl w:val="0"/>
-                <w:numId w:val="34"/>
-              </w:numPr>
-              <w:suppressAutoHyphens w:val="0"/>
-              <w:spacing w:beforeAutospacing="1" w:afterAutospacing="1"/>
-            </w:pPr>
-            <w:r>
-              <w:t xml:space="preserve">Wrote robust </w:t>
-            </w:r>
-            <w:r>
-              <w:rPr>
-                <w:rStyle w:val="Strong"/>
-              </w:rPr>
-              <w:t>unit and functional tests</w:t>
-            </w:r>
-            <w:r>
-              <w:t xml:space="preserve"> using </w:t>
-            </w:r>
-            <w:r>
-              <w:rPr>
-                <w:rStyle w:val="Strong"/>
-              </w:rPr>
-              <w:t>PHPUnit</w:t>
-            </w:r>
-            <w:r>
-              <w:t xml:space="preserve"> and </w:t>
-            </w:r>
-            <w:r>
-              <w:rPr>
-                <w:rStyle w:val="Strong"/>
-              </w:rPr>
-              <w:t>Codeception</w:t>
-            </w:r>
-            <w:r>
-              <w:t>, significantly increasing test coverage and reducing post-deployment defects</w:t>
-            </w:r>
-          </w:p>
-          <w:p>
-            <w:pPr>
-              <w:pStyle w:val="NormalWeb"/>
-              <w:numPr>
-                <w:ilvl w:val="0"/>
-                <w:numId w:val="34"/>
-              </w:numPr>
-              <w:suppressAutoHyphens w:val="0"/>
-              <w:spacing w:beforeAutospacing="1" w:afterAutospacing="1"/>
-            </w:pPr>
-            <w:r>
-              <w:t>Collaborated with cross-functional teams across development, QA, and DevOps to ensure seamless CI/CD integration and smooth production releases</w:t>
-            </w:r>
-          </w:p>
-        </w:tc>
-      </w:tr>
-    </w:tbl>
-    <w:p>
-      <w:pPr>
-        <w:suppressAutoHyphens w:val="0"/>
-        <w:rPr>
-          <w:b/>
-          <w:bCs/>
-          <w:u w:val="single"/>
-        </w:rPr>
       </w:pPr>
     </w:p>
     <w:p>
       <w:pPr>
-        <w:pStyle w:val="NormalWeb"/>
+        <w:rPr>
+          <w:i/>
+          <w:iCs/>
+        </w:rPr>
+      </w:pPr>
+    </w:p>
+    <w:p>
+      <w:pPr>
+        <w:rPr>
+          <w:i/>
+          <w:iCs/>
+        </w:rPr>
       </w:pPr>
       <w:r>
         <w:rPr>
@@ -2703,12 +2705,132 @@
         </w:numPr>
         <w:suppressAutoHyphens w:val="0"/>
         <w:spacing w:beforeAutospacing="1" w:afterAutospacing="1"/>
-      </w:pPr>
-      <w:r>
         <w:rPr>
           <w:rStyle w:val="Emphasis"/>
-        </w:rPr>
-        <w:t xml:space="preserve">Senior Symfony Developer </w:t>
+          <w:i w:val="0"/>
+          <w:iCs w:val="0"/>
+        </w:rPr>
+      </w:pPr>
+      <w:r>
+        <w:rPr>
+          <w:rStyle w:val="Emphasis"/>
+        </w:rPr>
+        <w:t>Senior PHP Developer</w:t>
+      </w:r>
+      <w:r>
+        <w:rPr>
+          <w:rStyle w:val="Emphasis"/>
+        </w:rPr>
+        <w:t xml:space="preserve"> at </w:t>
+      </w:r>
+      <w:r>
+        <w:rPr>
+          <w:rStyle w:val="Strong"/>
+        </w:rPr>
+        <w:t>Salmon Ltd</w:t>
+      </w:r>
+      <w:r>
+        <w:rPr>
+          <w:rStyle w:val="Emphasis"/>
+        </w:rPr>
+        <w:tab/>
+      </w:r>
+      <w:r>
+        <w:rPr>
+          <w:rStyle w:val="Emphasis"/>
+        </w:rPr>
+        <w:tab/>
+      </w:r>
+      <w:r>
+        <w:rPr>
+          <w:rStyle w:val="Emphasis"/>
+        </w:rPr>
+        <w:tab/>
+      </w:r>
+      <w:r>
+        <w:rPr>
+          <w:rStyle w:val="Emphasis"/>
+        </w:rPr>
+        <w:tab/>
+      </w:r>
+      <w:r>
+        <w:rPr>
+          <w:rStyle w:val="Strong"/>
+          <w:b w:val="0"/>
+          <w:bCs w:val="0"/>
+        </w:rPr>
+        <w:t xml:space="preserve">- </w:t>
+      </w:r>
+      <w:r>
+        <w:rPr>
+          <w:rStyle w:val="Emphasis"/>
+        </w:rPr>
+        <w:t>Nov</w:t>
+      </w:r>
+      <w:r>
+        <w:rPr>
+          <w:rStyle w:val="Emphasis"/>
+        </w:rPr>
+        <w:t xml:space="preserve"> 201</w:t>
+      </w:r>
+      <w:r>
+        <w:rPr>
+          <w:rStyle w:val="Emphasis"/>
+        </w:rPr>
+        <w:t>5</w:t>
+      </w:r>
+      <w:r>
+        <w:rPr>
+          <w:rStyle w:val="Emphasis"/>
+        </w:rPr>
+        <w:t xml:space="preserve"> – </w:t>
+      </w:r>
+      <w:r>
+        <w:rPr>
+          <w:rStyle w:val="Emphasis"/>
+        </w:rPr>
+        <w:t>Mar</w:t>
+      </w:r>
+      <w:r>
+        <w:rPr>
+          <w:rStyle w:val="Emphasis"/>
+        </w:rPr>
+        <w:t xml:space="preserve"> 201</w:t>
+      </w:r>
+      <w:r>
+        <w:rPr>
+          <w:rStyle w:val="Emphasis"/>
+        </w:rPr>
+        <w:t>6</w:t>
+      </w:r>
+      <w:r>
+        <w:rPr>
+          <w:rStyle w:val="Emphasis"/>
+        </w:rPr>
+        <w:t>.</w:t>
+      </w:r>
+    </w:p>
+    <w:p>
+      <w:pPr>
+        <w:pStyle w:val="NormalWeb"/>
+        <w:numPr>
+          <w:ilvl w:val="0"/>
+          <w:numId w:val="35"/>
+        </w:numPr>
+        <w:suppressAutoHyphens w:val="0"/>
+        <w:spacing w:beforeAutospacing="1" w:afterAutospacing="1"/>
+      </w:pPr>
+      <w:r>
+        <w:rPr>
+          <w:rStyle w:val="Emphasis"/>
+        </w:rPr>
+        <w:t>S</w:t>
+      </w:r>
+      <w:r>
+        <w:rPr>
+          <w:rStyle w:val="Emphasis"/>
+        </w:rPr>
+        <w:t xml:space="preserve">enior Symfony Developer </w:t>
       </w:r>
       <w:r>
         <w:rPr>

</xml_diff>